<commit_message>
A2D, CC, and UTH posts for 12(Dec)_2025
</commit_message>
<xml_diff>
--- a/Posts/2025/12(Dec)/Aristotle2Digital/A2D_12(Dec)_2025_A_Symbolic_Experiment1-FirstExpression.docx
+++ b/Posts/2025/12(Dec)/Aristotle2Digital/A2D_12(Dec)_2025_A_Symbolic_Experiment1-FirstExpression.docx
@@ -40,7 +40,13 @@
         <w:t xml:space="preserve"> that</w:t>
       </w:r>
       <w:r>
-        <w:t xml:space="preserve"> were solved by the </w:t>
+        <w:t xml:space="preserve"> were solved </w:t>
+      </w:r>
+      <w:r>
+        <w:t>as</w:t>
+      </w:r>
+      <w:r>
+        <w:t xml:space="preserve"> the </w:t>
       </w:r>
       <w:r>
         <w:t xml:space="preserve">‘hot’ topics </w:t>
@@ -121,8 +127,17 @@
         <w:t xml:space="preserve">on the market today, such </w:t>
       </w:r>
       <w:r>
-        <w:t xml:space="preserve">as wxMaxima, Maple, Mathematica, and </w:t>
-      </w:r>
+        <w:t xml:space="preserve">as </w:t>
+      </w:r>
+      <w:proofErr w:type="spellStart"/>
+      <w:r>
+        <w:t>wxMaxima</w:t>
+      </w:r>
+      <w:proofErr w:type="spellEnd"/>
+      <w:r>
+        <w:t xml:space="preserve">, Maple, Mathematica, and </w:t>
+      </w:r>
+      <w:proofErr w:type="spellStart"/>
       <w:r>
         <w:t>S</w:t>
       </w:r>
@@ -135,6 +150,7 @@
       <w:r>
         <w:t>y</w:t>
       </w:r>
+      <w:proofErr w:type="spellEnd"/>
       <w:r>
         <w:t xml:space="preserve">.  Each of these is polished </w:t>
       </w:r>
@@ -235,6 +251,9 @@
       <w:r>
         <w:t xml:space="preserve"> when you can write, even more when you can teach, but certain when you can program</w:t>
       </w:r>
+      <w:r>
+        <w:t>.</w:t>
+      </w:r>
     </w:p>
     <w:p>
       <w:r>
@@ -330,7 +349,15 @@
     </w:p>
     <w:p>
       <w:r>
-        <w:t xml:space="preserve">For this first experiment, I chose Sympy as the </w:t>
+        <w:t xml:space="preserve">For this first experiment, I chose </w:t>
+      </w:r>
+      <w:proofErr w:type="spellStart"/>
+      <w:r>
+        <w:t>Sympy</w:t>
+      </w:r>
+      <w:proofErr w:type="spellEnd"/>
+      <w:r>
+        <w:t xml:space="preserve"> as the </w:t>
       </w:r>
       <w:r>
         <w:t xml:space="preserve">tool of choice as it </w:t>
@@ -361,8 +388,13 @@
       <w:r>
         <w:t xml:space="preserve">example, </w:t>
       </w:r>
-      <w:r>
-        <w:t xml:space="preserve">SymPy version 1.14 </w:t>
+      <w:proofErr w:type="spellStart"/>
+      <w:r>
+        <w:t>SymPy</w:t>
+      </w:r>
+      <w:proofErr w:type="spellEnd"/>
+      <w:r>
+        <w:t xml:space="preserve"> version 1.14 </w:t>
       </w:r>
       <w:r>
         <w:t xml:space="preserve">knows that the transform is </w:t>
@@ -398,7 +430,15 @@
         <w:t xml:space="preserve"> </w:t>
       </w:r>
       <w:r>
-        <w:t xml:space="preserve">{\mathcal </w:t>
+        <w:t>{\</w:t>
+      </w:r>
+      <w:proofErr w:type="spellStart"/>
+      <w:r>
+        <w:t>mathcal</w:t>
+      </w:r>
+      <w:proofErr w:type="spellEnd"/>
+      <w:r>
+        <w:t xml:space="preserve"> </w:t>
       </w:r>
       <w:proofErr w:type="gramStart"/>
       <w:r>
@@ -436,7 +476,15 @@
       </w:r>
       <w:proofErr w:type="gramEnd"/>
       <w:r>
-        <w:t>right] = i \</w:t>
+        <w:t xml:space="preserve">right] = </w:t>
+      </w:r>
+      <w:proofErr w:type="spellStart"/>
+      <w:r>
+        <w:t>i</w:t>
+      </w:r>
+      <w:proofErr w:type="spellEnd"/>
+      <w:r>
+        <w:t xml:space="preserve"> \</w:t>
       </w:r>
       <w:proofErr w:type="gramStart"/>
       <w:r>
@@ -445,9 +493,14 @@
       <w:r>
         <w:t>{\</w:t>
       </w:r>
-      <w:proofErr w:type="gramEnd"/>
-      <w:r>
-        <w:t xml:space="preserve">mathcal </w:t>
+      <w:proofErr w:type="spellStart"/>
+      <w:proofErr w:type="gramEnd"/>
+      <w:r>
+        <w:t>mathcal</w:t>
+      </w:r>
+      <w:proofErr w:type="spellEnd"/>
+      <w:r>
+        <w:t xml:space="preserve"> </w:t>
       </w:r>
       <w:proofErr w:type="gramStart"/>
       <w:r>
@@ -552,7 +605,15 @@
         <w:t xml:space="preserve">F(\omega) = </w:t>
       </w:r>
       <w:r>
-        <w:t xml:space="preserve">{\mathcal </w:t>
+        <w:t>{\</w:t>
+      </w:r>
+      <w:proofErr w:type="spellStart"/>
+      <w:r>
+        <w:t>mathcal</w:t>
+      </w:r>
+      <w:proofErr w:type="spellEnd"/>
+      <w:r>
+        <w:t xml:space="preserve"> </w:t>
       </w:r>
       <w:proofErr w:type="gramStart"/>
       <w:r>
@@ -627,16 +688,49 @@
       <w:r>
         <w:t>Linearity:  $</w:t>
       </w:r>
-      <w:proofErr w:type="gramStart"/>
-      <w:r>
-        <w:t>FT(</w:t>
+      <w:r>
+        <w:t>{\</w:t>
+      </w:r>
+      <w:proofErr w:type="spellStart"/>
+      <w:r>
+        <w:t>mathcal</w:t>
+      </w:r>
+      <w:proofErr w:type="spellEnd"/>
+      <w:r>
+        <w:t xml:space="preserve"> </w:t>
+      </w:r>
+      <w:proofErr w:type="gramStart"/>
+      <w:r>
+        <w:t>F</w:t>
+      </w:r>
+      <w:r>
+        <w:t>}</w:t>
+      </w:r>
+      <w:r>
+        <w:t>(</w:t>
       </w:r>
       <w:proofErr w:type="gramEnd"/>
       <w:r>
         <w:t>a</w:t>
       </w:r>
       <w:r>
-        <w:t xml:space="preserve"> \cdot f(t) + b \cdot g(t</w:t>
+        <w:t xml:space="preserve"> \</w:t>
+      </w:r>
+      <w:proofErr w:type="spellStart"/>
+      <w:r>
+        <w:t>cdot</w:t>
+      </w:r>
+      <w:proofErr w:type="spellEnd"/>
+      <w:r>
+        <w:t xml:space="preserve"> f(t) + b \</w:t>
+      </w:r>
+      <w:proofErr w:type="spellStart"/>
+      <w:r>
+        <w:t>cdot</w:t>
+      </w:r>
+      <w:proofErr w:type="spellEnd"/>
+      <w:r>
+        <w:t xml:space="preserve"> g(t</w:t>
       </w:r>
       <w:proofErr w:type="gramStart"/>
       <w:r>
@@ -673,42 +767,74 @@
         <w:t>$</w:t>
       </w:r>
       <w:r>
-        <w:t>\mathcal{F}\</w:t>
-      </w:r>
-      <w:proofErr w:type="gramStart"/>
-      <w:r>
-        <w:t>left{</w:t>
-      </w:r>
-      <w:proofErr w:type="gramEnd"/>
-      <w:r>
         <w:t>\</w:t>
       </w:r>
+      <w:proofErr w:type="spellStart"/>
+      <w:r>
+        <w:t>mathcal</w:t>
+      </w:r>
+      <w:proofErr w:type="spellEnd"/>
+      <w:r>
+        <w:t>{F}\</w:t>
+      </w:r>
+      <w:proofErr w:type="gramStart"/>
+      <w:r>
+        <w:t>left</w:t>
+      </w:r>
+      <w:r>
+        <w:t>[</w:t>
+      </w:r>
+      <w:proofErr w:type="gramEnd"/>
+      <w:r>
+        <w:t>\</w:t>
+      </w:r>
       <w:proofErr w:type="gramStart"/>
       <w:r>
         <w:t>frac{</w:t>
       </w:r>
-      <w:proofErr w:type="gramEnd"/>
-      <w:r>
-        <w:t>d^n f(t</w:t>
+      <w:proofErr w:type="spellStart"/>
+      <w:proofErr w:type="gramEnd"/>
+      <w:r>
+        <w:t>d^n</w:t>
+      </w:r>
+      <w:proofErr w:type="spellEnd"/>
+      <w:r>
+        <w:t xml:space="preserve"> f(t</w:t>
       </w:r>
       <w:proofErr w:type="gramStart"/>
       <w:r>
         <w:t>)}{</w:t>
       </w:r>
+      <w:proofErr w:type="spellStart"/>
       <w:proofErr w:type="gramEnd"/>
       <w:r>
         <w:t>dt^</w:t>
       </w:r>
       <w:proofErr w:type="gramStart"/>
       <w:r>
-        <w:t>n}\</w:t>
-      </w:r>
-      <w:proofErr w:type="gramEnd"/>
-      <w:r>
-        <w:t>right} = (</w:t>
-      </w:r>
-      <w:r>
-        <w:t xml:space="preserve">i </w:t>
+        <w:t>n</w:t>
+      </w:r>
+      <w:proofErr w:type="spellEnd"/>
+      <w:r>
+        <w:t>}\</w:t>
+      </w:r>
+      <w:proofErr w:type="gramEnd"/>
+      <w:r>
+        <w:t>right</w:t>
+      </w:r>
+      <w:r>
+        <w:t>]</w:t>
+      </w:r>
+      <w:r>
+        <w:t xml:space="preserve"> = (</w:t>
+      </w:r>
+      <w:proofErr w:type="spellStart"/>
+      <w:r>
+        <w:t>i</w:t>
+      </w:r>
+      <w:proofErr w:type="spellEnd"/>
+      <w:r>
+        <w:t xml:space="preserve"> </w:t>
       </w:r>
       <w:r>
         <w:t>\</w:t>
@@ -719,8 +845,16 @@
       </w:r>
       <w:proofErr w:type="gramEnd"/>
       <w:r>
-        <w:t>n F(\omega)</w:t>
-      </w:r>
+        <w:t>n F(\</w:t>
+      </w:r>
+      <w:proofErr w:type="gramStart"/>
+      <w:r>
+        <w:t>omega)</w:t>
+      </w:r>
+      <w:r>
+        <w:t>$</w:t>
+      </w:r>
+      <w:proofErr w:type="gramEnd"/>
     </w:p>
     <w:p>
       <w:pPr>
@@ -734,7 +868,15 @@
         <w:t>Time Shifting:  $</w:t>
       </w:r>
       <w:r>
-        <w:t>\mathcal{F</w:t>
+        <w:t>\</w:t>
+      </w:r>
+      <w:proofErr w:type="spellStart"/>
+      <w:r>
+        <w:t>mathcal</w:t>
+      </w:r>
+      <w:proofErr w:type="spellEnd"/>
+      <w:r>
+        <w:t>{F</w:t>
       </w:r>
       <w:proofErr w:type="gramStart"/>
       <w:r>
@@ -752,9 +894,11 @@
       <w:r>
         <w:t>-</w:t>
       </w:r>
+      <w:proofErr w:type="spellStart"/>
       <w:r>
         <w:t>i</w:t>
       </w:r>
+      <w:proofErr w:type="spellEnd"/>
       <w:r>
         <w:t xml:space="preserve"> \omega t_0} F(\</w:t>
       </w:r>
@@ -779,7 +923,15 @@
         <w:t>Frequency Shifting: $</w:t>
       </w:r>
       <w:r>
-        <w:t>\mathcal{F</w:t>
+        <w:t>\</w:t>
+      </w:r>
+      <w:proofErr w:type="spellStart"/>
+      <w:r>
+        <w:t>mathcal</w:t>
+      </w:r>
+      <w:proofErr w:type="spellEnd"/>
+      <w:r>
+        <w:t>{F</w:t>
       </w:r>
       <w:proofErr w:type="gramStart"/>
       <w:r>
@@ -793,9 +945,14 @@
       <w:r>
         <w:t>^{</w:t>
       </w:r>
-      <w:proofErr w:type="gramEnd"/>
-      <w:r>
-        <w:t xml:space="preserve">i </w:t>
+      <w:proofErr w:type="spellStart"/>
+      <w:proofErr w:type="gramEnd"/>
+      <w:r>
+        <w:t>i</w:t>
+      </w:r>
+      <w:proofErr w:type="spellEnd"/>
+      <w:r>
+        <w:t xml:space="preserve"> </w:t>
       </w:r>
       <w:r>
         <w:t xml:space="preserve">\omega_0 t} f(t)} = </w:t>
@@ -819,6 +976,7 @@
     </w:p>
     <w:p>
       <w:r>
+        <w:lastRenderedPageBreak/>
         <w:t xml:space="preserve">We expect </w:t>
       </w:r>
       <w:r>
@@ -856,7 +1014,6 @@
       </w:r>
       <w:proofErr w:type="gramStart"/>
       <w:r>
-        <w:lastRenderedPageBreak/>
         <w:t>But,</w:t>
       </w:r>
       <w:proofErr w:type="gramEnd"/>
@@ -875,7 +1032,10 @@
     </w:p>
     <w:p>
       <w:r>
-        <w:t xml:space="preserve">His </w:t>
+        <w:t>Our hypothetical college student’s</w:t>
+      </w:r>
+      <w:r>
+        <w:t xml:space="preserve"> </w:t>
       </w:r>
       <w:r>
         <w:t xml:space="preserve">capacity to learn, even when not explicitly </w:t>
@@ -922,7 +1082,7 @@
         <w:t xml:space="preserve">oes requires a lot of introspection into just </w:t>
       </w:r>
       <w:r>
-        <w:t>how the symbols are being interpreted and parsed.</w:t>
+        <w:t>how the symbols are being interpreted.</w:t>
       </w:r>
       <w:r>
         <w:t xml:space="preserve">  Mathematical expressions </w:t>
@@ -1031,7 +1191,21 @@
         <w:rPr>
           <w:lang w:val="fr-FR"/>
         </w:rPr>
-        <w:t xml:space="preserve"> \cdot f(t) </w:t>
+        <w:t xml:space="preserve"> \</w:t>
+      </w:r>
+      <w:proofErr w:type="spellStart"/>
+      <w:r>
+        <w:rPr>
+          <w:lang w:val="fr-FR"/>
+        </w:rPr>
+        <w:t>cdot</w:t>
+      </w:r>
+      <w:proofErr w:type="spellEnd"/>
+      <w:r>
+        <w:rPr>
+          <w:lang w:val="fr-FR"/>
+        </w:rPr>
+        <w:t xml:space="preserve"> f(t) </w:t>
       </w:r>
       <w:proofErr w:type="gramStart"/>
       <w:r>
@@ -1057,7 +1231,21 @@
         <w:rPr>
           <w:lang w:val="fr-FR"/>
         </w:rPr>
-        <w:t xml:space="preserve"> \cdot g(t) </w:t>
+        <w:t xml:space="preserve"> \</w:t>
+      </w:r>
+      <w:proofErr w:type="spellStart"/>
+      <w:r>
+        <w:rPr>
+          <w:lang w:val="fr-FR"/>
+        </w:rPr>
+        <w:t>cdot</w:t>
+      </w:r>
+      <w:proofErr w:type="spellEnd"/>
+      <w:r>
+        <w:rPr>
+          <w:lang w:val="fr-FR"/>
+        </w:rPr>
+        <w:t xml:space="preserve"> g(t) </w:t>
       </w:r>
       <w:proofErr w:type="gramStart"/>
       <w:r>
@@ -1147,8 +1335,13 @@
       </w:r>
     </w:p>
     <w:p>
-      <w:r>
-        <w:t xml:space="preserve">SymPy’s answer to this (which matches most of the other </w:t>
+      <w:proofErr w:type="spellStart"/>
+      <w:r>
+        <w:t>SymPy’s</w:t>
+      </w:r>
+      <w:proofErr w:type="spellEnd"/>
+      <w:r>
+        <w:t xml:space="preserve"> answer to this (which matches most of the other </w:t>
       </w:r>
       <w:r>
         <w:t>CASs</w:t>
@@ -1164,7 +1357,14 @@
           <w:b/>
           <w:bCs/>
         </w:rPr>
-        <w:t>symbols</w:t>
+        <w:t>S</w:t>
+      </w:r>
+      <w:r>
+        <w:rPr>
+          <w:b/>
+          <w:bCs/>
+        </w:rPr>
+        <w:t>ymbols</w:t>
       </w:r>
       <w:r>
         <w:t xml:space="preserve"> and ‘f</w:t>
@@ -1200,7 +1400,15 @@
         <w:t xml:space="preserve">are </w:t>
       </w:r>
       <w:r>
-        <w:t xml:space="preserve">syntactically how SymPy </w:t>
+        <w:t xml:space="preserve">syntactically how </w:t>
+      </w:r>
+      <w:proofErr w:type="spellStart"/>
+      <w:r>
+        <w:t>SymPy</w:t>
+      </w:r>
+      <w:proofErr w:type="spellEnd"/>
+      <w:r>
+        <w:t xml:space="preserve"> </w:t>
       </w:r>
       <w:r>
         <w:t>creates these symbolic objects.</w:t>
@@ -1225,9 +1433,14 @@
       <w:r>
         <w:t xml:space="preserve">), </w:t>
       </w:r>
-      <w:proofErr w:type="gramStart"/>
-      <w:r>
-        <w:t>len(</w:t>
+      <w:proofErr w:type="spellStart"/>
+      <w:proofErr w:type="gramStart"/>
+      <w:r>
+        <w:t>len</w:t>
+      </w:r>
+      <w:proofErr w:type="spellEnd"/>
+      <w:r>
+        <w:t>(</w:t>
       </w:r>
       <w:proofErr w:type="gramEnd"/>
       <w:r>
@@ -1242,7 +1455,15 @@
         <w:t xml:space="preserve">), </w:t>
       </w:r>
       <w:r>
-        <w:t xml:space="preserve">etc.) coming along because SymPy </w:t>
+        <w:t xml:space="preserve">etc.) coming along because </w:t>
+      </w:r>
+      <w:proofErr w:type="spellStart"/>
+      <w:r>
+        <w:t>SymPy</w:t>
+      </w:r>
+      <w:proofErr w:type="spellEnd"/>
+      <w:r>
+        <w:t xml:space="preserve"> </w:t>
       </w:r>
       <w:r>
         <w:t xml:space="preserve">tries to strictly adhere to the Python data model.  </w:t>
@@ -1253,21 +1474,81 @@
       <w:r>
         <w:t xml:space="preserve">new expressions by using ‘+’ and ‘*’ without worrying about how </w:t>
       </w:r>
-      <w:r>
-        <w:t>SymPy chooses to add and multiply it various objects together.</w:t>
+      <w:proofErr w:type="spellStart"/>
+      <w:r>
+        <w:t>SymPy</w:t>
+      </w:r>
+      <w:proofErr w:type="spellEnd"/>
+      <w:r>
+        <w:t xml:space="preserve"> chooses to add and multiply it various objects together.</w:t>
       </w:r>
     </w:p>
     <w:p>
       <w:r>
-        <w:t>The following figure shows the output of a Jupyter notebook</w:t>
+        <w:t xml:space="preserve">The following figure shows the output of a </w:t>
+      </w:r>
+      <w:proofErr w:type="spellStart"/>
+      <w:r>
+        <w:t>Jupyter</w:t>
+      </w:r>
+      <w:proofErr w:type="spellEnd"/>
+      <w:r>
+        <w:t xml:space="preserve"> notebook</w:t>
       </w:r>
       <w:r>
         <w:t xml:space="preserve"> that implements these simple steps.</w:t>
       </w:r>
     </w:p>
     <w:p>
-      <w:r>
-        <w:t>**image**</w:t>
+      <w:pPr>
+        <w:jc w:val="center"/>
+      </w:pPr>
+      <w:r>
+        <w:rPr>
+          <w:noProof/>
+        </w:rPr>
+        <w:lastRenderedPageBreak/>
+        <w:drawing>
+          <wp:inline distT="0" distB="0" distL="0" distR="0" wp14:anchorId="5402F831" wp14:editId="1DD35E74">
+            <wp:extent cx="2612141" cy="2209804"/>
+            <wp:effectExtent l="0" t="0" r="0" b="0"/>
+            <wp:docPr id="1453607648" name="Picture 1"/>
+            <wp:cNvGraphicFramePr>
+              <a:graphicFrameLocks xmlns:a="http://schemas.openxmlformats.org/drawingml/2006/main" noChangeAspect="1"/>
+            </wp:cNvGraphicFramePr>
+            <a:graphic xmlns:a="http://schemas.openxmlformats.org/drawingml/2006/main">
+              <a:graphicData uri="http://schemas.openxmlformats.org/drawingml/2006/picture">
+                <pic:pic xmlns:pic="http://schemas.openxmlformats.org/drawingml/2006/picture">
+                  <pic:nvPicPr>
+                    <pic:cNvPr id="1453607648" name="Picture 1453607648"/>
+                    <pic:cNvPicPr/>
+                  </pic:nvPicPr>
+                  <pic:blipFill>
+                    <a:blip r:embed="rId5" cstate="print">
+                      <a:extLst>
+                        <a:ext uri="{28A0092B-C50C-407E-A947-70E740481C1C}">
+                          <a14:useLocalDpi xmlns:a14="http://schemas.microsoft.com/office/drawing/2010/main" val="0"/>
+                        </a:ext>
+                      </a:extLst>
+                    </a:blip>
+                    <a:stretch>
+                      <a:fillRect/>
+                    </a:stretch>
+                  </pic:blipFill>
+                  <pic:spPr>
+                    <a:xfrm>
+                      <a:off x="0" y="0"/>
+                      <a:ext cx="2612141" cy="2209804"/>
+                    </a:xfrm>
+                    <a:prstGeom prst="rect">
+                      <a:avLst/>
+                    </a:prstGeom>
+                  </pic:spPr>
+                </pic:pic>
+              </a:graphicData>
+            </a:graphic>
+          </wp:inline>
+        </w:drawing>
       </w:r>
     </w:p>
     <w:p>
@@ -1277,6 +1558,7 @@
       <w:r>
         <w:t xml:space="preserve">type(a) gives back </w:t>
       </w:r>
+      <w:proofErr w:type="spellStart"/>
       <w:proofErr w:type="gramStart"/>
       <w:r>
         <w:t>sympy.core</w:t>
@@ -1289,10 +1571,12 @@
       <w:r>
         <w:t>symbol.Symbol</w:t>
       </w:r>
+      <w:proofErr w:type="spellEnd"/>
       <w:proofErr w:type="gramEnd"/>
       <w:r>
         <w:t xml:space="preserve"> and type(f) returns </w:t>
       </w:r>
+      <w:proofErr w:type="spellStart"/>
       <w:proofErr w:type="gramStart"/>
       <w:r>
         <w:t>sympy.core</w:t>
@@ -1305,6 +1589,7 @@
       <w:r>
         <w:t>function.UndefinedFunction</w:t>
       </w:r>
+      <w:proofErr w:type="spellEnd"/>
       <w:proofErr w:type="gramEnd"/>
       <w:r>
         <w:t>.</w:t>
@@ -1314,9 +1599,13 @@
       </w:r>
     </w:p>
     <w:p>
-      <w:r>
-        <w:lastRenderedPageBreak/>
-        <w:t>my_expr = a*f(t) + b*g(t)</w:t>
+      <w:proofErr w:type="spellStart"/>
+      <w:r>
+        <w:t>my_expr</w:t>
+      </w:r>
+      <w:proofErr w:type="spellEnd"/>
+      <w:r>
+        <w:t xml:space="preserve"> = a*f(t) + b*g(t)</w:t>
       </w:r>
     </w:p>
     <w:p>
@@ -1341,12 +1630,22 @@
         <w:t xml:space="preserve">details.  But what to make of </w:t>
       </w:r>
       <w:r>
-        <w:t xml:space="preserve">type(my_expr) returning </w:t>
-      </w:r>
+        <w:t>type(</w:t>
+      </w:r>
+      <w:proofErr w:type="spellStart"/>
+      <w:r>
+        <w:t>my_expr</w:t>
+      </w:r>
+      <w:proofErr w:type="spellEnd"/>
+      <w:r>
+        <w:t xml:space="preserve">) returning </w:t>
+      </w:r>
+      <w:proofErr w:type="spellStart"/>
       <w:proofErr w:type="gramStart"/>
       <w:r>
         <w:t>sympy.core.add.Add</w:t>
       </w:r>
+      <w:proofErr w:type="spellEnd"/>
       <w:proofErr w:type="gramEnd"/>
       <w:r>
         <w:t>?</w:t>
@@ -1357,8 +1656,29 @@
         <w:t xml:space="preserve">The answer to this question gets at the heart of </w:t>
       </w:r>
       <w:r>
-        <w:t>how most (if not all) CASs work.  What we humans take for granted as a simple expression $a \cdot f(t) + b \cdot g(t)$ is, for SymPy</w:t>
-      </w:r>
+        <w:t>how most (if not all) CASs work.  What we humans take for granted as a simple expression $a \</w:t>
+      </w:r>
+      <w:proofErr w:type="spellStart"/>
+      <w:r>
+        <w:t>cdot</w:t>
+      </w:r>
+      <w:proofErr w:type="spellEnd"/>
+      <w:r>
+        <w:t xml:space="preserve"> f(t) + b \</w:t>
+      </w:r>
+      <w:proofErr w:type="spellStart"/>
+      <w:r>
+        <w:t>cdot</w:t>
+      </w:r>
+      <w:proofErr w:type="spellEnd"/>
+      <w:r>
+        <w:t xml:space="preserve"> g(t)$ is, for </w:t>
+      </w:r>
+      <w:proofErr w:type="spellStart"/>
+      <w:r>
+        <w:t>SymPy</w:t>
+      </w:r>
+      <w:proofErr w:type="spellEnd"/>
       <w:r>
         <w:t xml:space="preserve"> (and all the other CASs that I’ve seen)</w:t>
       </w:r>
@@ -1372,7 +1692,23 @@
         <w:t xml:space="preserve">ode is </w:t>
       </w:r>
       <w:r>
-        <w:t xml:space="preserve">this case is Add meaning that ‘+’ is the root and each of the two subexpressions ($a \cdot f(t)$ and $b \cdot g(t)$) </w:t>
+        <w:t>this case is Add meaning that ‘+’ is the root and each of the two subexpressions ($a \</w:t>
+      </w:r>
+      <w:proofErr w:type="spellStart"/>
+      <w:r>
+        <w:t>cdot</w:t>
+      </w:r>
+      <w:proofErr w:type="spellEnd"/>
+      <w:r>
+        <w:t xml:space="preserve"> f(t)$ and $b \</w:t>
+      </w:r>
+      <w:proofErr w:type="spellStart"/>
+      <w:r>
+        <w:t>cdot</w:t>
+      </w:r>
+      <w:proofErr w:type="spellEnd"/>
+      <w:r>
+        <w:t xml:space="preserve"> g(t)$) </w:t>
       </w:r>
       <w:r>
         <w:t>are child nodes</w:t>
@@ -1380,13 +1716,23 @@
       <w:r>
         <w:t xml:space="preserve">, each of type </w:t>
       </w:r>
+      <w:proofErr w:type="spellStart"/>
       <w:proofErr w:type="gramStart"/>
       <w:r>
         <w:t>sympy.core.mul.Mul</w:t>
       </w:r>
-      <w:proofErr w:type="gramEnd"/>
-      <w:r>
-        <w:t xml:space="preserve">.  SymPy symbols are atomic nodes that can only be root nodes or child nodes but </w:t>
+      <w:proofErr w:type="spellEnd"/>
+      <w:proofErr w:type="gramEnd"/>
+      <w:r>
+        <w:t xml:space="preserve">.  </w:t>
+      </w:r>
+      <w:proofErr w:type="spellStart"/>
+      <w:r>
+        <w:t>SymPy</w:t>
+      </w:r>
+      <w:proofErr w:type="spellEnd"/>
+      <w:r>
+        <w:t xml:space="preserve"> symbols are atomic nodes that can only be root nodes or child nodes but </w:t>
       </w:r>
       <w:r>
         <w:t>can never serve as</w:t>
@@ -1402,7 +1748,14 @@
           <w:b/>
           <w:bCs/>
         </w:rPr>
-        <w:t>symbol</w:t>
+        <w:t>S</w:t>
+      </w:r>
+      <w:r>
+        <w:rPr>
+          <w:b/>
+          <w:bCs/>
+        </w:rPr>
+        <w:t>ymbol</w:t>
       </w:r>
       <w:r>
         <w:t xml:space="preserve"> and </w:t>
@@ -1415,7 +1768,7 @@
         <w:t>Function</w:t>
       </w:r>
       <w:r>
-        <w:t xml:space="preserve"> objects are now much clearer:  giving a glyph the designation as a </w:t>
+        <w:t xml:space="preserve"> objects are now much clearer: giving a glyph the designation as a </w:t>
       </w:r>
       <w:r>
         <w:rPr>
@@ -1425,7 +1778,21 @@
         <w:t>Function</w:t>
       </w:r>
       <w:r>
-        <w:t xml:space="preserve"> means it can serve as a parent node, even if all of it behavior is, </w:t>
+        <w:t xml:space="preserve"> means it can serve as a parent node, even if </w:t>
+      </w:r>
+      <w:proofErr w:type="gramStart"/>
+      <w:r>
+        <w:t>all of</w:t>
+      </w:r>
+      <w:proofErr w:type="gramEnd"/>
+      <w:r>
+        <w:t xml:space="preserve"> it</w:t>
+      </w:r>
+      <w:r>
+        <w:t>s</w:t>
+      </w:r>
+      <w:r>
+        <w:t xml:space="preserve"> behavior is, </w:t>
       </w:r>
       <w:proofErr w:type="gramStart"/>
       <w:r>
@@ -1446,7 +1813,51 @@
     </w:p>
     <w:p>
       <w:r>
-        <w:t>**image**</w:t>
+        <w:rPr>
+          <w:noProof/>
+        </w:rPr>
+        <w:lastRenderedPageBreak/>
+        <w:drawing>
+          <wp:inline distT="0" distB="0" distL="0" distR="0" wp14:anchorId="375D242B" wp14:editId="3BA75778">
+            <wp:extent cx="2164084" cy="2612141"/>
+            <wp:effectExtent l="0" t="0" r="7620" b="0"/>
+            <wp:docPr id="1858404867" name="Picture 2"/>
+            <wp:cNvGraphicFramePr>
+              <a:graphicFrameLocks xmlns:a="http://schemas.openxmlformats.org/drawingml/2006/main" noChangeAspect="1"/>
+            </wp:cNvGraphicFramePr>
+            <a:graphic xmlns:a="http://schemas.openxmlformats.org/drawingml/2006/main">
+              <a:graphicData uri="http://schemas.openxmlformats.org/drawingml/2006/picture">
+                <pic:pic xmlns:pic="http://schemas.openxmlformats.org/drawingml/2006/picture">
+                  <pic:nvPicPr>
+                    <pic:cNvPr id="1858404867" name="Picture 1858404867"/>
+                    <pic:cNvPicPr/>
+                  </pic:nvPicPr>
+                  <pic:blipFill>
+                    <a:blip r:embed="rId6" cstate="print">
+                      <a:extLst>
+                        <a:ext uri="{28A0092B-C50C-407E-A947-70E740481C1C}">
+                          <a14:useLocalDpi xmlns:a14="http://schemas.microsoft.com/office/drawing/2010/main" val="0"/>
+                        </a:ext>
+                      </a:extLst>
+                    </a:blip>
+                    <a:stretch>
+                      <a:fillRect/>
+                    </a:stretch>
+                  </pic:blipFill>
+                  <pic:spPr>
+                    <a:xfrm>
+                      <a:off x="0" y="0"/>
+                      <a:ext cx="2164084" cy="2612141"/>
+                    </a:xfrm>
+                    <a:prstGeom prst="rect">
+                      <a:avLst/>
+                    </a:prstGeom>
+                  </pic:spPr>
+                </pic:pic>
+              </a:graphicData>
+            </a:graphic>
+          </wp:inline>
+        </w:drawing>
       </w:r>
     </w:p>
     <w:p>
@@ -3254,6 +3665,7 @@
   <w:style w:type="character" w:default="1" w:styleId="DefaultParagraphFont">
     <w:name w:val="Default Paragraph Font"/>
     <w:uiPriority w:val="1"/>
+    <w:semiHidden/>
     <w:unhideWhenUsed/>
   </w:style>
   <w:style w:type="table" w:default="1" w:styleId="TableNormal">

</xml_diff>